<commit_message>
fix auto change status sale contract and update print sale contract
</commit_message>
<xml_diff>
--- a/public/templates/hop_dong_ban_hang.docx
+++ b/public/templates/hop_dong_ban_hang.docx
@@ -241,51 +241,10 @@
             </w:pPr>
             <w:r>
               <w:rPr>
-                <w:noProof/>
                 <w:sz w:val="18"/>
                 <w:szCs w:val="18"/>
               </w:rPr>
-              <w:drawing>
-                <wp:inline distT="0" distB="0" distL="0" distR="0" wp14:anchorId="394D8FC6" wp14:editId="2B996A94">
-                  <wp:extent cx="1057275" cy="1057275"/>
-                  <wp:effectExtent l="0" t="0" r="9525" b="9525"/>
-                  <wp:docPr id="321201464" name="Picture 1"/>
-                  <wp:cNvGraphicFramePr>
-                    <a:graphicFrameLocks xmlns:a="http://schemas.openxmlformats.org/drawingml/2006/main" noChangeAspect="1"/>
-                  </wp:cNvGraphicFramePr>
-                  <a:graphic xmlns:a="http://schemas.openxmlformats.org/drawingml/2006/main">
-                    <a:graphicData uri="http://schemas.openxmlformats.org/drawingml/2006/picture">
-                      <pic:pic xmlns:pic="http://schemas.openxmlformats.org/drawingml/2006/picture">
-                        <pic:nvPicPr>
-                          <pic:cNvPr id="321201464" name="Picture 321201464"/>
-                          <pic:cNvPicPr/>
-                        </pic:nvPicPr>
-                        <pic:blipFill>
-                          <a:blip r:embed="rId5" cstate="print">
-                            <a:extLst>
-                              <a:ext uri="{28A0092B-C50C-407E-A947-70E740481C1C}">
-                                <a14:useLocalDpi xmlns:a14="http://schemas.microsoft.com/office/drawing/2010/main" val="0"/>
-                              </a:ext>
-                            </a:extLst>
-                          </a:blip>
-                          <a:stretch>
-                            <a:fillRect/>
-                          </a:stretch>
-                        </pic:blipFill>
-                        <pic:spPr>
-                          <a:xfrm flipH="1">
-                            <a:off x="0" y="0"/>
-                            <a:ext cx="1057427" cy="1057427"/>
-                          </a:xfrm>
-                          <a:prstGeom prst="rect">
-                            <a:avLst/>
-                          </a:prstGeom>
-                        </pic:spPr>
-                      </pic:pic>
-                    </a:graphicData>
-                  </a:graphic>
-                </wp:inline>
-              </w:drawing>
+              <w:t>{%qr_code}</w:t>
             </w:r>
           </w:p>
         </w:tc>
@@ -1531,6 +1490,7 @@
               <w:spacing w:after="160" w:line="276" w:lineRule="auto"/>
             </w:pPr>
             <w:r>
+              <w:lastRenderedPageBreak/>
               <w:t xml:space="preserve">                               </w:t>
             </w:r>
           </w:p>
@@ -1548,7 +1508,6 @@
                 <w:b/>
                 <w:bCs/>
               </w:rPr>
-              <w:lastRenderedPageBreak/>
               <w:t xml:space="preserve">Ghi chú: </w:t>
             </w:r>
             <w:r>
@@ -1618,9 +1577,14 @@
           </w:p>
           <w:p>
             <w:pPr>
+              <w:tabs>
+                <w:tab w:val="left" w:pos="720"/>
+              </w:tabs>
               <w:spacing w:after="120" w:line="276" w:lineRule="auto"/>
-              <w:jc w:val="center"/>
-            </w:pPr>
+            </w:pPr>
+            <w:r>
+              <w:tab/>
+            </w:r>
           </w:p>
           <w:p>
             <w:pPr>
@@ -1642,13 +1606,184 @@
       </w:pPr>
     </w:p>
     <w:sectPr>
-      <w:pgSz w:w="11906" w:h="16838"/>
-      <w:pgMar w:top="720" w:right="720" w:bottom="720" w:left="720" w:header="708" w:footer="708" w:gutter="0"/>
+      <w:footerReference w:type="default" r:id="rId7"/>
+      <w:pgSz w:w="11906" w:h="16838" w:code="9"/>
+      <w:pgMar w:top="720" w:right="720" w:bottom="720" w:left="720" w:header="709" w:footer="709" w:gutter="0"/>
       <w:cols w:space="720"/>
       <w:docGrid w:linePitch="360"/>
     </w:sectPr>
   </w:body>
 </w:document>
+</file>
+
+<file path=word/endnotes.xml><?xml version="1.0" encoding="utf-8"?>
+<w:endnotes xmlns:wpc="http://schemas.microsoft.com/office/word/2010/wordprocessingCanvas" xmlns:cx="http://schemas.microsoft.com/office/drawing/2014/chartex" xmlns:cx1="http://schemas.microsoft.com/office/drawing/2015/9/8/chartex" xmlns:cx2="http://schemas.microsoft.com/office/drawing/2015/10/21/chartex" xmlns:cx3="http://schemas.microsoft.com/office/drawing/2016/5/9/chartex" xmlns:cx4="http://schemas.microsoft.com/office/drawing/2016/5/10/chartex" xmlns:cx5="http://schemas.microsoft.com/office/drawing/2016/5/11/chartex" xmlns:cx6="http://schemas.microsoft.com/office/drawing/2016/5/12/chartex" xmlns:cx7="http://schemas.microsoft.com/office/drawing/2016/5/13/chartex" xmlns:cx8="http://schemas.microsoft.com/office/drawing/2016/5/14/chartex" xmlns:mc="http://schemas.openxmlformats.org/markup-compatibility/2006" xmlns:aink="http://schemas.microsoft.com/office/drawing/2016/ink" xmlns:am3d="http://schemas.microsoft.com/office/drawing/2017/model3d" xmlns:o="urn:schemas-microsoft-com:office:office" xmlns:oel="http://schemas.microsoft.com/office/2019/extlst" xmlns:r="http://schemas.openxmlformats.org/officeDocument/2006/relationships" xmlns:m="http://schemas.openxmlformats.org/officeDocument/2006/math" xmlns:v="urn:schemas-microsoft-com:vml" xmlns:wp14="http://schemas.microsoft.com/office/word/2010/wordprocessingDrawing" xmlns:wp="http://schemas.openxmlformats.org/drawingml/2006/wordprocessingDrawing" xmlns:w10="urn:schemas-microsoft-com:office:word" xmlns:w="http://schemas.openxmlformats.org/wordprocessingml/2006/main" xmlns:w14="http://schemas.microsoft.com/office/word/2010/wordml" xmlns:w15="http://schemas.microsoft.com/office/word/2012/wordml" xmlns:w16cex="http://schemas.microsoft.com/office/word/2018/wordml/cex" xmlns:w16cid="http://schemas.microsoft.com/office/word/2016/wordml/cid" xmlns:w16="http://schemas.microsoft.com/office/word/2018/wordml" xmlns:w16du="http://schemas.microsoft.com/office/word/2023/wordml/word16du" xmlns:w16sdtdh="http://schemas.microsoft.com/office/word/2020/wordml/sdtdatahash" xmlns:w16sdtfl="http://schemas.microsoft.com/office/word/2024/wordml/sdtformatlock" xmlns:w16se="http://schemas.microsoft.com/office/word/2015/wordml/symex" xmlns:wpg="http://schemas.microsoft.com/office/word/2010/wordprocessingGroup" xmlns:wpi="http://schemas.microsoft.com/office/word/2010/wordprocessingInk" xmlns:wne="http://schemas.microsoft.com/office/word/2006/wordml" xmlns:wps="http://schemas.microsoft.com/office/word/2010/wordprocessingShape" mc:Ignorable="w14 w15 w16se w16cid w16 w16cex w16sdtdh w16sdtfl w16du wp14">
+  <w:endnote w:type="separator" w:id="-1">
+    <w:p>
+      <w:r>
+        <w:separator/>
+      </w:r>
+    </w:p>
+  </w:endnote>
+  <w:endnote w:type="continuationSeparator" w:id="0">
+    <w:p>
+      <w:r>
+        <w:continuationSeparator/>
+      </w:r>
+    </w:p>
+  </w:endnote>
+</w:endnotes>
+</file>
+
+<file path=word/footer1.xml><?xml version="1.0" encoding="utf-8"?>
+<w:ftr xmlns:wpc="http://schemas.microsoft.com/office/word/2010/wordprocessingCanvas" xmlns:cx="http://schemas.microsoft.com/office/drawing/2014/chartex" xmlns:cx1="http://schemas.microsoft.com/office/drawing/2015/9/8/chartex" xmlns:cx2="http://schemas.microsoft.com/office/drawing/2015/10/21/chartex" xmlns:cx3="http://schemas.microsoft.com/office/drawing/2016/5/9/chartex" xmlns:cx4="http://schemas.microsoft.com/office/drawing/2016/5/10/chartex" xmlns:cx5="http://schemas.microsoft.com/office/drawing/2016/5/11/chartex" xmlns:cx6="http://schemas.microsoft.com/office/drawing/2016/5/12/chartex" xmlns:cx7="http://schemas.microsoft.com/office/drawing/2016/5/13/chartex" xmlns:cx8="http://schemas.microsoft.com/office/drawing/2016/5/14/chartex" xmlns:mc="http://schemas.openxmlformats.org/markup-compatibility/2006" xmlns:aink="http://schemas.microsoft.com/office/drawing/2016/ink" xmlns:am3d="http://schemas.microsoft.com/office/drawing/2017/model3d" xmlns:o="urn:schemas-microsoft-com:office:office" xmlns:oel="http://schemas.microsoft.com/office/2019/extlst" xmlns:r="http://schemas.openxmlformats.org/officeDocument/2006/relationships" xmlns:m="http://schemas.openxmlformats.org/officeDocument/2006/math" xmlns:v="urn:schemas-microsoft-com:vml" xmlns:wp14="http://schemas.microsoft.com/office/word/2010/wordprocessingDrawing" xmlns:wp="http://schemas.openxmlformats.org/drawingml/2006/wordprocessingDrawing" xmlns:w10="urn:schemas-microsoft-com:office:word" xmlns:w="http://schemas.openxmlformats.org/wordprocessingml/2006/main" xmlns:w14="http://schemas.microsoft.com/office/word/2010/wordml" xmlns:w15="http://schemas.microsoft.com/office/word/2012/wordml" xmlns:w16cex="http://schemas.microsoft.com/office/word/2018/wordml/cex" xmlns:w16cid="http://schemas.microsoft.com/office/word/2016/wordml/cid" xmlns:w16="http://schemas.microsoft.com/office/word/2018/wordml" xmlns:w16du="http://schemas.microsoft.com/office/word/2023/wordml/word16du" xmlns:w16sdtdh="http://schemas.microsoft.com/office/word/2020/wordml/sdtdatahash" xmlns:w16sdtfl="http://schemas.microsoft.com/office/word/2024/wordml/sdtformatlock" xmlns:w16se="http://schemas.microsoft.com/office/word/2015/wordml/symex" xmlns:wpg="http://schemas.microsoft.com/office/word/2010/wordprocessingGroup" xmlns:wpi="http://schemas.microsoft.com/office/word/2010/wordprocessingInk" xmlns:wne="http://schemas.microsoft.com/office/word/2006/wordml" xmlns:wps="http://schemas.microsoft.com/office/word/2010/wordprocessingShape" mc:Ignorable="w14 w15 w16se w16cid w16 w16cex w16sdtdh w16sdtfl w16du wp14">
+  <w:p>
+    <w:pPr>
+      <w:pStyle w:val="Footer"/>
+      <w:tabs>
+        <w:tab w:val="clear" w:pos="4680"/>
+        <w:tab w:val="clear" w:pos="9360"/>
+      </w:tabs>
+      <w:jc w:val="center"/>
+      <w:rPr>
+        <w:caps/>
+        <w:noProof/>
+      </w:rPr>
+    </w:pPr>
+    <w:r>
+      <w:rPr>
+        <w:caps/>
+      </w:rPr>
+      <w:fldChar w:fldCharType="begin"/>
+    </w:r>
+    <w:r>
+      <w:rPr>
+        <w:caps/>
+      </w:rPr>
+      <w:instrText xml:space="preserve"> PAGE   \* MERGEFORMAT </w:instrText>
+    </w:r>
+    <w:r>
+      <w:rPr>
+        <w:caps/>
+      </w:rPr>
+      <w:fldChar w:fldCharType="separate"/>
+    </w:r>
+    <w:r>
+      <w:rPr>
+        <w:caps/>
+        <w:noProof/>
+      </w:rPr>
+      <w:t>2</w:t>
+    </w:r>
+    <w:r>
+      <w:rPr>
+        <w:caps/>
+        <w:noProof/>
+      </w:rPr>
+      <w:fldChar w:fldCharType="end"/>
+    </w:r>
+  </w:p>
+  <w:p>
+    <w:pPr>
+      <w:pStyle w:val="Footer"/>
+      <w:tabs>
+        <w:tab w:val="clear" w:pos="4680"/>
+        <w:tab w:val="clear" w:pos="9360"/>
+      </w:tabs>
+      <w:jc w:val="right"/>
+      <w:rPr>
+        <w:caps/>
+        <w:noProof/>
+      </w:rPr>
+    </w:pPr>
+    <w:r>
+      <w:rPr>
+        <w:noProof/>
+      </w:rPr>
+      <w:tab/>
+    </w:r>
+    <w:r>
+      <w:rPr>
+        <w:noProof/>
+      </w:rPr>
+      <w:tab/>
+    </w:r>
+    <w:r>
+      <w:rPr>
+        <w:noProof/>
+      </w:rPr>
+      <w:tab/>
+    </w:r>
+    <w:r>
+      <w:rPr>
+        <w:noProof/>
+      </w:rPr>
+      <w:tab/>
+    </w:r>
+    <w:r>
+      <w:rPr>
+        <w:noProof/>
+      </w:rPr>
+      <w:tab/>
+    </w:r>
+    <w:r>
+      <w:rPr>
+        <w:noProof/>
+      </w:rPr>
+      <w:tab/>
+    </w:r>
+    <w:r>
+      <w:rPr>
+        <w:noProof/>
+      </w:rPr>
+      <w:tab/>
+    </w:r>
+    <w:r>
+      <w:rPr>
+        <w:noProof/>
+      </w:rPr>
+      <w:tab/>
+    </w:r>
+    <w:r>
+      <w:rPr>
+        <w:noProof/>
+      </w:rPr>
+      <w:tab/>
+    </w:r>
+    <w:r>
+      <w:rPr>
+        <w:noProof/>
+      </w:rPr>
+      <w:tab/>
+      <w:t xml:space="preserve">Số lần in: </w:t>
+    </w:r>
+    <w:r>
+      <w:rPr>
+        <w:noProof/>
+      </w:rPr>
+      <w:t>{print_count}</w:t>
+    </w:r>
+  </w:p>
+</w:ftr>
+</file>
+
+<file path=word/footnotes.xml><?xml version="1.0" encoding="utf-8"?>
+<w:footnotes xmlns:wpc="http://schemas.microsoft.com/office/word/2010/wordprocessingCanvas" xmlns:cx="http://schemas.microsoft.com/office/drawing/2014/chartex" xmlns:cx1="http://schemas.microsoft.com/office/drawing/2015/9/8/chartex" xmlns:cx2="http://schemas.microsoft.com/office/drawing/2015/10/21/chartex" xmlns:cx3="http://schemas.microsoft.com/office/drawing/2016/5/9/chartex" xmlns:cx4="http://schemas.microsoft.com/office/drawing/2016/5/10/chartex" xmlns:cx5="http://schemas.microsoft.com/office/drawing/2016/5/11/chartex" xmlns:cx6="http://schemas.microsoft.com/office/drawing/2016/5/12/chartex" xmlns:cx7="http://schemas.microsoft.com/office/drawing/2016/5/13/chartex" xmlns:cx8="http://schemas.microsoft.com/office/drawing/2016/5/14/chartex" xmlns:mc="http://schemas.openxmlformats.org/markup-compatibility/2006" xmlns:aink="http://schemas.microsoft.com/office/drawing/2016/ink" xmlns:am3d="http://schemas.microsoft.com/office/drawing/2017/model3d" xmlns:o="urn:schemas-microsoft-com:office:office" xmlns:oel="http://schemas.microsoft.com/office/2019/extlst" xmlns:r="http://schemas.openxmlformats.org/officeDocument/2006/relationships" xmlns:m="http://schemas.openxmlformats.org/officeDocument/2006/math" xmlns:v="urn:schemas-microsoft-com:vml" xmlns:wp14="http://schemas.microsoft.com/office/word/2010/wordprocessingDrawing" xmlns:wp="http://schemas.openxmlformats.org/drawingml/2006/wordprocessingDrawing" xmlns:w10="urn:schemas-microsoft-com:office:word" xmlns:w="http://schemas.openxmlformats.org/wordprocessingml/2006/main" xmlns:w14="http://schemas.microsoft.com/office/word/2010/wordml" xmlns:w15="http://schemas.microsoft.com/office/word/2012/wordml" xmlns:w16cex="http://schemas.microsoft.com/office/word/2018/wordml/cex" xmlns:w16cid="http://schemas.microsoft.com/office/word/2016/wordml/cid" xmlns:w16="http://schemas.microsoft.com/office/word/2018/wordml" xmlns:w16du="http://schemas.microsoft.com/office/word/2023/wordml/word16du" xmlns:w16sdtdh="http://schemas.microsoft.com/office/word/2020/wordml/sdtdatahash" xmlns:w16sdtfl="http://schemas.microsoft.com/office/word/2024/wordml/sdtformatlock" xmlns:w16se="http://schemas.microsoft.com/office/word/2015/wordml/symex" xmlns:wpg="http://schemas.microsoft.com/office/word/2010/wordprocessingGroup" xmlns:wpi="http://schemas.microsoft.com/office/word/2010/wordprocessingInk" xmlns:wne="http://schemas.microsoft.com/office/word/2006/wordml" xmlns:wps="http://schemas.microsoft.com/office/word/2010/wordprocessingShape" mc:Ignorable="w14 w15 w16se w16cid w16 w16cex w16sdtdh w16sdtfl w16du wp14">
+  <w:footnote w:type="separator" w:id="-1">
+    <w:p>
+      <w:r>
+        <w:separator/>
+      </w:r>
+    </w:p>
+  </w:footnote>
+  <w:footnote w:type="continuationSeparator" w:id="0">
+    <w:p>
+      <w:r>
+        <w:continuationSeparator/>
+      </w:r>
+    </w:p>
+  </w:footnote>
+</w:footnotes>
 </file>
 
 <file path=word/numbering.xml><?xml version="1.0" encoding="utf-8"?>
@@ -2290,7 +2425,6 @@
   <w:style w:type="character" w:default="1" w:styleId="DefaultParagraphFont">
     <w:name w:val="Default Paragraph Font"/>
     <w:uiPriority w:val="1"/>
-    <w:semiHidden/>
     <w:unhideWhenUsed/>
   </w:style>
   <w:style w:type="table" w:default="1" w:styleId="TableNormal">
@@ -2374,6 +2508,48 @@
       <w:sz w:val="20"/>
       <w:szCs w:val="20"/>
     </w:rPr>
+  </w:style>
+  <w:style w:type="paragraph" w:styleId="Header">
+    <w:name w:val="header"/>
+    <w:basedOn w:val="Normal"/>
+    <w:link w:val="HeaderChar"/>
+    <w:uiPriority w:val="99"/>
+    <w:unhideWhenUsed/>
+    <w:rsid w:val="00B85BB4"/>
+    <w:pPr>
+      <w:tabs>
+        <w:tab w:val="center" w:pos="4680"/>
+        <w:tab w:val="right" w:pos="9360"/>
+      </w:tabs>
+    </w:pPr>
+  </w:style>
+  <w:style w:type="character" w:customStyle="1" w:styleId="HeaderChar">
+    <w:name w:val="Header Char"/>
+    <w:basedOn w:val="DefaultParagraphFont"/>
+    <w:link w:val="Header"/>
+    <w:uiPriority w:val="99"/>
+    <w:rsid w:val="00B85BB4"/>
+  </w:style>
+  <w:style w:type="paragraph" w:styleId="Footer">
+    <w:name w:val="footer"/>
+    <w:basedOn w:val="Normal"/>
+    <w:link w:val="FooterChar"/>
+    <w:uiPriority w:val="99"/>
+    <w:unhideWhenUsed/>
+    <w:rsid w:val="00B85BB4"/>
+    <w:pPr>
+      <w:tabs>
+        <w:tab w:val="center" w:pos="4680"/>
+        <w:tab w:val="right" w:pos="9360"/>
+      </w:tabs>
+    </w:pPr>
+  </w:style>
+  <w:style w:type="character" w:customStyle="1" w:styleId="FooterChar">
+    <w:name w:val="Footer Char"/>
+    <w:basedOn w:val="DefaultParagraphFont"/>
+    <w:link w:val="Footer"/>
+    <w:uiPriority w:val="99"/>
+    <w:rsid w:val="00B85BB4"/>
   </w:style>
 </w:styles>
 </file>

</xml_diff>